<commit_message>
plotting manual slf density with mean
</commit_message>
<xml_diff>
--- a/output/masterthesis/Struktur_Masterarbeit.docx
+++ b/output/masterthesis/Struktur_Masterarbeit.docx
@@ -53,8 +53,19 @@
           <w:color w:val="EE0000"/>
           <w:lang w:val="en-US"/>
         </w:rPr>
-        <w:t xml:space="preserve"> Signals ..?</w:t>
-      </w:r>
+        <w:t xml:space="preserve"> Signals</w:t>
+      </w:r>
+      <w:proofErr w:type="gramStart"/>
+      <w:r>
+        <w:rPr>
+          <w:b/>
+          <w:bCs/>
+          <w:color w:val="EE0000"/>
+          <w:lang w:val="en-US"/>
+        </w:rPr>
+        <w:t xml:space="preserve"> ..?</w:t>
+      </w:r>
+      <w:proofErr w:type="gramEnd"/>
     </w:p>
     <w:p>
       <w:pPr>
@@ -478,10 +489,18 @@
         </w:numPr>
       </w:pPr>
       <w:r>
-        <w:t xml:space="preserve">Übergang zur automatisierten Messung </w:t>
-      </w:r>
-      <w:r>
-        <w:t xml:space="preserve"> (Rammsonde</w:t>
+        <w:t xml:space="preserve">Übergang zur automatisierten </w:t>
+      </w:r>
+      <w:proofErr w:type="gramStart"/>
+      <w:r>
+        <w:t xml:space="preserve">Messung </w:t>
+      </w:r>
+      <w:r>
+        <w:t xml:space="preserve"> (</w:t>
+      </w:r>
+      <w:proofErr w:type="gramEnd"/>
+      <w:r>
+        <w:t>Rammsonde</w:t>
       </w:r>
       <w:r>
         <w:t xml:space="preserve">, </w:t>
@@ -498,10 +517,18 @@
         <w:t xml:space="preserve">), </w:t>
       </w:r>
       <w:r>
-        <w:t xml:space="preserve">Radar &gt; </w:t>
-      </w:r>
-      <w:r>
-        <w:t xml:space="preserve"> zu schlecht </w:t>
+        <w:t xml:space="preserve">Radar </w:t>
+      </w:r>
+      <w:proofErr w:type="gramStart"/>
+      <w:r>
+        <w:t xml:space="preserve">&gt; </w:t>
+      </w:r>
+      <w:r>
+        <w:t xml:space="preserve"> zu</w:t>
+      </w:r>
+      <w:proofErr w:type="gramEnd"/>
+      <w:r>
+        <w:t xml:space="preserve"> schlecht </w:t>
       </w:r>
       <w:r>
         <w:t xml:space="preserve">und </w:t>
@@ -957,7 +984,21 @@
         <w:rPr>
           <w:lang w:val="en-US"/>
         </w:rPr>
-        <w:t xml:space="preserve">Die Struktur </w:t>
+        <w:t xml:space="preserve">Die </w:t>
+      </w:r>
+      <w:proofErr w:type="spellStart"/>
+      <w:r>
+        <w:rPr>
+          <w:lang w:val="en-US"/>
+        </w:rPr>
+        <w:t>Struktur</w:t>
+      </w:r>
+      <w:proofErr w:type="spellEnd"/>
+      <w:r>
+        <w:rPr>
+          <w:lang w:val="en-US"/>
+        </w:rPr>
+        <w:t xml:space="preserve"> </w:t>
       </w:r>
       <w:proofErr w:type="spellStart"/>
       <w:r>
@@ -1015,19 +1056,11 @@
       <w:r>
         <w:t xml:space="preserve">Rohsignal → 2. Aufbereitung (Qualität &amp; Software) → 3. Interpretation → 4. </w:t>
       </w:r>
-      <w:proofErr w:type="spellStart"/>
-      <w:r>
-        <w:rPr>
-          <w:lang w:val="en-US"/>
-        </w:rPr>
-        <w:t>Anwendungsparameter</w:t>
-      </w:r>
-      <w:proofErr w:type="spellEnd"/>
-      <w:r>
-        <w:rPr>
-          <w:lang w:val="en-US"/>
-        </w:rPr>
-        <w:t>.</w:t>
+      <w:r>
+        <w:rPr>
+          <w:lang w:val="en-US"/>
+        </w:rPr>
+        <w:t>Anwendungsparameter.</w:t>
       </w:r>
     </w:p>
     <w:p>
@@ -1427,7 +1460,21 @@
         <w:rPr>
           <w:lang w:val="en-US"/>
         </w:rPr>
-        <w:t xml:space="preserve"> ( von .</w:t>
+        <w:t xml:space="preserve"> </w:t>
+      </w:r>
+      <w:proofErr w:type="gramStart"/>
+      <w:r>
+        <w:rPr>
+          <w:lang w:val="en-US"/>
+        </w:rPr>
+        <w:t>( von</w:t>
+      </w:r>
+      <w:proofErr w:type="gramEnd"/>
+      <w:r>
+        <w:rPr>
+          <w:lang w:val="en-US"/>
+        </w:rPr>
+        <w:t xml:space="preserve"> .</w:t>
       </w:r>
       <w:proofErr w:type="spellStart"/>
       <w:r>
@@ -2717,11 +2764,16 @@
     </w:p>
     <w:p>
       <w:r>
-        <w:t xml:space="preserve">Fotos mit Markierungen vom Messaufbau </w:t>
+        <w:t>Fotos mit Markierungen vom Messaufbau</w:t>
+      </w:r>
+      <w:proofErr w:type="gramStart"/>
+      <w:r>
+        <w:t xml:space="preserve"> </w:t>
       </w:r>
       <w:r>
         <w:t>..</w:t>
       </w:r>
+      <w:proofErr w:type="gramEnd"/>
     </w:p>
     <w:tbl>
       <w:tblPr>
@@ -4199,8 +4251,21 @@
         <w:t>Nicht im Datensatz aber v</w:t>
       </w:r>
       <w:r>
-        <w:t>eröffentlicht auf Schneeprofilseite des SLF: Händische Schneeprofile von der gleichen Test Site, alle zwei Wochen, Tag überschneidet sich für die SMP Messung</w:t>
-      </w:r>
+        <w:t xml:space="preserve">eröffentlicht auf Schneeprofilseite des SLF: Händische Schneeprofile von der gleichen </w:t>
+      </w:r>
+      <w:proofErr w:type="gramStart"/>
+      <w:r>
+        <w:t>Test Site</w:t>
+      </w:r>
+      <w:proofErr w:type="gramEnd"/>
+      <w:r>
+        <w:t xml:space="preserve">, alle zwei Wochen, Tag überschneidet sich für die </w:t>
+      </w:r>
+      <w:proofErr w:type="gramStart"/>
+      <w:r>
+        <w:t>SMP Messung</w:t>
+      </w:r>
+      <w:proofErr w:type="gramEnd"/>
       <w:r>
         <w:t>, beinhalten D</w:t>
       </w:r>
@@ -4225,7 +4290,15 @@
         <w:t>i</w:t>
       </w:r>
       <w:r>
-        <w:t xml:space="preserve">ch für Validierung von meiner Methode später verwende, mit zugehörigen SMP Datensätzen </w:t>
+        <w:t xml:space="preserve">ch für Validierung von meiner Methode später verwende, mit zugehörigen </w:t>
+      </w:r>
+      <w:proofErr w:type="gramStart"/>
+      <w:r>
+        <w:t>SMP Datensätzen</w:t>
+      </w:r>
+      <w:proofErr w:type="gramEnd"/>
+      <w:r>
+        <w:t xml:space="preserve"> </w:t>
       </w:r>
     </w:p>
     <w:p>
@@ -4263,10 +4336,7 @@
         <w:t>1229</w:t>
       </w:r>
       <w:r>
-        <w:t>)</w:t>
-      </w:r>
-      <w:r>
-        <w:t xml:space="preserve">, </w:t>
+        <w:t xml:space="preserve">), </w:t>
       </w:r>
       <w:r>
         <w:t>1x Frühjahr</w:t>
@@ -4862,10 +4932,18 @@
     </w:p>
     <w:p>
       <w:r>
-        <w:t>Die folgenden Methoden werden v</w:t>
-      </w:r>
-      <w:r>
-        <w:t xml:space="preserve">orgestellt um das Signal zu verarbeiten: </w:t>
+        <w:t xml:space="preserve">Die folgenden Methoden werden </w:t>
+      </w:r>
+      <w:proofErr w:type="gramStart"/>
+      <w:r>
+        <w:t>v</w:t>
+      </w:r>
+      <w:r>
+        <w:t>orgestellt</w:t>
+      </w:r>
+      <w:proofErr w:type="gramEnd"/>
+      <w:r>
+        <w:t xml:space="preserve"> um das Signal zu verarbeiten: </w:t>
       </w:r>
       <w:proofErr w:type="spellStart"/>
       <w:r>
@@ -5128,10 +5206,12 @@
         <w:t xml:space="preserve"> via </w:t>
       </w:r>
       <w:proofErr w:type="spellStart"/>
+      <w:proofErr w:type="gramStart"/>
       <w:r>
         <w:t>numpy.gradient</w:t>
       </w:r>
       <w:proofErr w:type="spellEnd"/>
+      <w:proofErr w:type="gramEnd"/>
       <w:r>
         <w:t>(), Standardabweichung als Schwellwertbasis</w:t>
       </w:r>
@@ -5899,14 +5979,28 @@
         <w:rPr>
           <w:lang w:val="en-US"/>
         </w:rPr>
-        <w:t>autodetect_ground</w:t>
-      </w:r>
-      <w:proofErr w:type="spellEnd"/>
-      <w:r>
-        <w:rPr>
-          <w:lang w:val="en-US"/>
-        </w:rPr>
-        <w:t>() (</w:t>
+        <w:t>autodetect_</w:t>
+      </w:r>
+      <w:proofErr w:type="gramStart"/>
+      <w:r>
+        <w:rPr>
+          <w:lang w:val="en-US"/>
+        </w:rPr>
+        <w:t>ground</w:t>
+      </w:r>
+      <w:proofErr w:type="spellEnd"/>
+      <w:r>
+        <w:rPr>
+          <w:lang w:val="en-US"/>
+        </w:rPr>
+        <w:t>(</w:t>
+      </w:r>
+      <w:proofErr w:type="gramEnd"/>
+      <w:r>
+        <w:rPr>
+          <w:lang w:val="en-US"/>
+        </w:rPr>
+        <w:t>) (</w:t>
       </w:r>
       <w:proofErr w:type="spellStart"/>
       <w:r>
@@ -6612,9 +6706,14 @@
           <w:numId w:val="31"/>
         </w:numPr>
       </w:pPr>
+      <w:proofErr w:type="gramStart"/>
       <w:r>
         <w:lastRenderedPageBreak/>
-        <w:t>Finde alle möglichen Kombinationsgruppen, in denen Threshold erfüllt wird in allen Nebendiagonalen</w:t>
+        <w:t>Finde</w:t>
+      </w:r>
+      <w:proofErr w:type="gramEnd"/>
+      <w:r>
+        <w:t xml:space="preserve"> alle möglichen Kombinationsgruppen, in denen Threshold erfüllt wird in allen Nebendiagonalen</w:t>
       </w:r>
     </w:p>
     <w:p>
@@ -6967,10 +7066,18 @@
         <w:t xml:space="preserve"> einfügen</w:t>
       </w:r>
       <w:r>
-        <w:t xml:space="preserve"> das Schritte darstellt </w:t>
-      </w:r>
-      <w:r>
-        <w:t>, z.</w:t>
+        <w:t xml:space="preserve"> das Schritte </w:t>
+      </w:r>
+      <w:proofErr w:type="gramStart"/>
+      <w:r>
+        <w:t xml:space="preserve">darstellt </w:t>
+      </w:r>
+      <w:r>
+        <w:t>,</w:t>
+      </w:r>
+      <w:proofErr w:type="gramEnd"/>
+      <w:r>
+        <w:t xml:space="preserve"> z.</w:t>
       </w:r>
       <w:r>
         <w:rPr>
@@ -7848,7 +7955,21 @@
         <w:rPr>
           <w:lang w:val="en-US"/>
         </w:rPr>
-        <w:t>Manuelle Dichtemessung (</w:t>
+        <w:t xml:space="preserve">Manuelle </w:t>
+      </w:r>
+      <w:proofErr w:type="spellStart"/>
+      <w:r>
+        <w:rPr>
+          <w:lang w:val="en-US"/>
+        </w:rPr>
+        <w:t>Dichtemessung</w:t>
+      </w:r>
+      <w:proofErr w:type="spellEnd"/>
+      <w:r>
+        <w:rPr>
+          <w:lang w:val="en-US"/>
+        </w:rPr>
+        <w:t xml:space="preserve"> (</w:t>
       </w:r>
       <w:proofErr w:type="spellStart"/>
       <w:r>
@@ -7916,11 +8037,16 @@
         <w:t xml:space="preserve"> </w:t>
       </w:r>
       <w:r>
-        <w:t>Dichteprofile nebeneinander: Einzelprofil vs. Mittelprofil</w:t>
+        <w:t xml:space="preserve">Dichteprofile nebeneinander: Einzelprofil vs. </w:t>
+      </w:r>
+      <w:proofErr w:type="gramStart"/>
+      <w:r>
+        <w:t>Mittelprofil</w:t>
       </w:r>
       <w:r>
         <w:t>..</w:t>
       </w:r>
+      <w:proofErr w:type="gramEnd"/>
     </w:p>
     <w:p>
       <w:pPr>
@@ -8031,11 +8157,16 @@
       </w:r>
       <w:proofErr w:type="spellEnd"/>
       <w:r>
-        <w:t xml:space="preserve"> ( 28</w:t>
+        <w:t xml:space="preserve"> </w:t>
+      </w:r>
+      <w:proofErr w:type="gramStart"/>
+      <w:r>
+        <w:t>( 28</w:t>
       </w:r>
       <w:r>
         <w:t>16</w:t>
       </w:r>
+      <w:proofErr w:type="gramEnd"/>
       <w:r>
         <w:t xml:space="preserve"> Profile mit manuell gesetztem Surface)</w:t>
       </w:r>
@@ -8335,7 +8466,15 @@
         <w:t>U = 4.208.064 u</w:t>
       </w:r>
       <w:r>
-        <w:t xml:space="preserve">, p&lt;1e-16 , </w:t>
+        <w:t>, p&lt;1e-</w:t>
+      </w:r>
+      <w:proofErr w:type="gramStart"/>
+      <w:r>
+        <w:t>16 ,</w:t>
+      </w:r>
+      <w:proofErr w:type="gramEnd"/>
+      <w:r>
+        <w:t xml:space="preserve"> </w:t>
       </w:r>
       <w:r>
         <w:t>Fehler der neuen Methode systematisch kleiner, Unterschied ist statistisch</w:t>
@@ -8565,18 +8704,42 @@
       </w:r>
     </w:p>
     <w:p>
+      <w:pPr>
+        <w:rPr>
+          <w:lang w:val="en-US"/>
+        </w:rPr>
+      </w:pPr>
       <w:commentRangeStart w:id="1"/>
       <w:r>
+        <w:rPr>
+          <w:lang w:val="en-US"/>
+        </w:rPr>
         <w:t>2016: S36M0442-46 -5.15mm</w:t>
       </w:r>
     </w:p>
     <w:p>
-      <w:r>
+      <w:pPr>
+        <w:rPr>
+          <w:lang w:val="en-US"/>
+        </w:rPr>
+      </w:pPr>
+      <w:r>
+        <w:rPr>
+          <w:lang w:val="en-US"/>
+        </w:rPr>
         <w:t>2019: S36M7920-23 -7.04mm</w:t>
       </w:r>
     </w:p>
     <w:p>
-      <w:r>
+      <w:pPr>
+        <w:rPr>
+          <w:lang w:val="en-US"/>
+        </w:rPr>
+      </w:pPr>
+      <w:r>
+        <w:rPr>
+          <w:lang w:val="en-US"/>
+        </w:rPr>
         <w:t>2025: S36N4031-33 -2.45mm</w:t>
       </w:r>
       <w:commentRangeEnd w:id="1"/>
@@ -8611,6 +8774,9 @@
     </w:p>
     <w:p>
       <w:r>
+        <w:rPr>
+          <w:noProof/>
+        </w:rPr>
         <w:drawing>
           <wp:inline distT="0" distB="0" distL="0" distR="0" wp14:anchorId="08CBA927" wp14:editId="0D44AF34">
             <wp:extent cx="5534797" cy="6735115"/>
@@ -8650,6 +8816,9 @@
     </w:p>
     <w:p>
       <w:r>
+        <w:rPr>
+          <w:noProof/>
+        </w:rPr>
         <w:lastRenderedPageBreak/>
         <w:drawing>
           <wp:inline distT="0" distB="0" distL="0" distR="0" wp14:anchorId="17A66DAF" wp14:editId="03E142C0">
@@ -8974,7 +9143,21 @@
         <w:rPr>
           <w:color w:val="EE0000"/>
         </w:rPr>
-        <w:t xml:space="preserve"> Oder in Diskussion wenn ich mich auf </w:t>
+        <w:t xml:space="preserve"> Oder in </w:t>
+      </w:r>
+      <w:proofErr w:type="gramStart"/>
+      <w:r>
+        <w:rPr>
+          <w:color w:val="EE0000"/>
+        </w:rPr>
+        <w:t>Diskussion</w:t>
+      </w:r>
+      <w:proofErr w:type="gramEnd"/>
+      <w:r>
+        <w:rPr>
+          <w:color w:val="EE0000"/>
+        </w:rPr>
+        <w:t xml:space="preserve"> wenn ich mich auf </w:t>
       </w:r>
       <w:proofErr w:type="spellStart"/>
       <w:r>
@@ -9103,6 +9286,7 @@
         <w:t>2)</w:t>
       </w:r>
       <w:proofErr w:type="spellStart"/>
+      <w:proofErr w:type="gramStart"/>
       <w:r>
         <w:t>Schweiz:</w:t>
       </w:r>
@@ -9110,6 +9294,7 @@
         <w:t>Für</w:t>
       </w:r>
       <w:proofErr w:type="spellEnd"/>
+      <w:proofErr w:type="gramEnd"/>
       <w:r>
         <w:t xml:space="preserve"> die ausgewählten drei tage auch jeweils die </w:t>
       </w:r>
@@ -9124,6 +9309,9 @@
     </w:p>
     <w:p>
       <w:r>
+        <w:rPr>
+          <w:noProof/>
+        </w:rPr>
         <w:drawing>
           <wp:inline distT="0" distB="0" distL="0" distR="0" wp14:anchorId="2C21B4BE" wp14:editId="6D138C59">
             <wp:extent cx="5706271" cy="5172797"/>
@@ -9335,7 +9523,15 @@
         <w:t>8833</w:t>
       </w:r>
       <w:r>
-        <w:t xml:space="preserve">. Für Tag 2 Threshold 0.75, es bleiben 4 weitere Profile die diesen erfüllen, das ausgewählte Profil hat die </w:t>
+        <w:t xml:space="preserve">. Für Tag 2 Threshold 0.75, es bleiben 4 weitere </w:t>
+      </w:r>
+      <w:proofErr w:type="gramStart"/>
+      <w:r>
+        <w:t>Profile</w:t>
+      </w:r>
+      <w:proofErr w:type="gramEnd"/>
+      <w:r>
+        <w:t xml:space="preserve"> die diesen erfüllen, das ausgewählte Profil hat die </w:t>
       </w:r>
       <w:r>
         <w:t>höchste</w:t>
@@ -9440,6 +9636,9 @@
     </w:p>
     <w:p>
       <w:r>
+        <w:rPr>
+          <w:noProof/>
+        </w:rPr>
         <w:lastRenderedPageBreak/>
         <w:drawing>
           <wp:inline distT="0" distB="0" distL="0" distR="0" wp14:anchorId="6FCE9AA3" wp14:editId="6339EAE8">
@@ -9580,6 +9779,9 @@
         </w:numPr>
       </w:pPr>
       <w:r>
+        <w:rPr>
+          <w:noProof/>
+        </w:rPr>
         <w:drawing>
           <wp:inline distT="0" distB="0" distL="0" distR="0" wp14:anchorId="2AD909A7" wp14:editId="19DE3B3B">
             <wp:extent cx="5760720" cy="2396490"/>
@@ -9631,7 +9833,21 @@
         <w:rPr>
           <w:color w:val="EE0000"/>
         </w:rPr>
-        <w:t xml:space="preserve">oder hier wenn nur 4 verbleibende Profile besser auch Einzelprofile? </w:t>
+        <w:t xml:space="preserve">oder </w:t>
+      </w:r>
+      <w:proofErr w:type="gramStart"/>
+      <w:r>
+        <w:rPr>
+          <w:color w:val="EE0000"/>
+        </w:rPr>
+        <w:t>hier</w:t>
+      </w:r>
+      <w:proofErr w:type="gramEnd"/>
+      <w:r>
+        <w:rPr>
+          <w:color w:val="EE0000"/>
+        </w:rPr>
+        <w:t xml:space="preserve"> wenn nur 4 verbleibende Profile besser auch Einzelprofile? </w:t>
       </w:r>
     </w:p>
     <w:p>
@@ -9642,6 +9858,9 @@
         </w:numPr>
       </w:pPr>
       <w:r>
+        <w:rPr>
+          <w:noProof/>
+        </w:rPr>
         <w:lastRenderedPageBreak/>
         <w:drawing>
           <wp:inline distT="0" distB="0" distL="0" distR="0" wp14:anchorId="2960B709" wp14:editId="7D9B140C">
@@ -9733,13 +9952,41 @@
         <w:rPr>
           <w:color w:val="EE0000"/>
         </w:rPr>
-        <w:t xml:space="preserve"> Output existiert schon, nur noch einfügen wenn ich weiß wie </w:t>
-      </w:r>
-      <w:proofErr w:type="spellStart"/>
+        <w:t xml:space="preserve"> Output existiert schon, nur noch </w:t>
+      </w:r>
+      <w:proofErr w:type="gramStart"/>
       <w:r>
         <w:rPr>
           <w:color w:val="EE0000"/>
         </w:rPr>
+        <w:t>einfügen</w:t>
+      </w:r>
+      <w:proofErr w:type="gramEnd"/>
+      <w:r>
+        <w:rPr>
+          <w:color w:val="EE0000"/>
+        </w:rPr>
+        <w:t xml:space="preserve"> wenn ich </w:t>
+      </w:r>
+      <w:proofErr w:type="gramStart"/>
+      <w:r>
+        <w:rPr>
+          <w:color w:val="EE0000"/>
+        </w:rPr>
+        <w:t>weiß</w:t>
+      </w:r>
+      <w:proofErr w:type="gramEnd"/>
+      <w:r>
+        <w:rPr>
+          <w:color w:val="EE0000"/>
+        </w:rPr>
+        <w:t xml:space="preserve"> wie </w:t>
+      </w:r>
+      <w:proofErr w:type="spellStart"/>
+      <w:r>
+        <w:rPr>
+          <w:color w:val="EE0000"/>
+        </w:rPr>
         <w:t>ichs</w:t>
       </w:r>
       <w:proofErr w:type="spellEnd"/>
@@ -9819,6 +10066,7 @@
         <w:t xml:space="preserve"> </w:t>
       </w:r>
       <w:proofErr w:type="spellStart"/>
+      <w:proofErr w:type="gramStart"/>
       <w:r>
         <w:rPr>
           <w:b/>
@@ -9832,7 +10080,15 @@
           <w:b/>
           <w:bCs/>
         </w:rPr>
-        <w:t>..hier die Ergebni</w:t>
+        <w:t>..</w:t>
+      </w:r>
+      <w:proofErr w:type="gramEnd"/>
+      <w:r>
+        <w:rPr>
+          <w:b/>
+          <w:bCs/>
+        </w:rPr>
+        <w:t>hier die Ergebni</w:t>
       </w:r>
       <w:r>
         <w:rPr>
@@ -9945,10 +10201,379 @@
         </w:numPr>
       </w:pPr>
       <w:r>
-        <w:t>IceCube vs. Einzel-SMP vs. Mittelwert-SMP</w:t>
-      </w:r>
-      <w:r>
-        <w:t xml:space="preserve"> als Linienplot</w:t>
+        <w:lastRenderedPageBreak/>
+        <w:t>Einzel-SMP vs. Mittelwert-SMP</w:t>
+      </w:r>
+      <w:r>
+        <w:t xml:space="preserve"> als Linienp</w:t>
+      </w:r>
+      <w:r>
+        <w:t>lot</w:t>
+      </w:r>
+      <w:r>
+        <w:drawing>
+          <wp:inline distT="0" distB="0" distL="0" distR="0" wp14:anchorId="74CA01F8" wp14:editId="7F8C05C4">
+            <wp:extent cx="2232045" cy="1426274"/>
+            <wp:effectExtent l="0" t="0" r="0" b="2540"/>
+            <wp:docPr id="2024951871" name="Grafik 1" descr="Ein Bild, das Text, Screenshot, Diagramm, Reihe enthält.&#10;&#10;KI-generierte Inhalte können fehlerhaft sein."/>
+            <wp:cNvGraphicFramePr>
+              <a:graphicFrameLocks xmlns:a="http://schemas.openxmlformats.org/drawingml/2006/main" noChangeAspect="1"/>
+            </wp:cNvGraphicFramePr>
+            <a:graphic xmlns:a="http://schemas.openxmlformats.org/drawingml/2006/main">
+              <a:graphicData uri="http://schemas.openxmlformats.org/drawingml/2006/picture">
+                <pic:pic xmlns:pic="http://schemas.openxmlformats.org/drawingml/2006/picture">
+                  <pic:nvPicPr>
+                    <pic:cNvPr id="2024951871" name="Grafik 1" descr="Ein Bild, das Text, Screenshot, Diagramm, Reihe enthält.&#10;&#10;KI-generierte Inhalte können fehlerhaft sein."/>
+                    <pic:cNvPicPr/>
+                  </pic:nvPicPr>
+                  <pic:blipFill>
+                    <a:blip r:embed="rId26"/>
+                    <a:stretch>
+                      <a:fillRect/>
+                    </a:stretch>
+                  </pic:blipFill>
+                  <pic:spPr>
+                    <a:xfrm>
+                      <a:off x="0" y="0"/>
+                      <a:ext cx="2261045" cy="1444805"/>
+                    </a:xfrm>
+                    <a:prstGeom prst="rect">
+                      <a:avLst/>
+                    </a:prstGeom>
+                  </pic:spPr>
+                </pic:pic>
+              </a:graphicData>
+            </a:graphic>
+          </wp:inline>
+        </w:drawing>
+      </w:r>
+      <w:r>
+        <w:drawing>
+          <wp:inline distT="0" distB="0" distL="0" distR="0" wp14:anchorId="4C2AD488" wp14:editId="61120F47">
+            <wp:extent cx="2327145" cy="1453953"/>
+            <wp:effectExtent l="0" t="0" r="0" b="0"/>
+            <wp:docPr id="1699520531" name="Grafik 1" descr="Ein Bild, das Text, Screenshot, Diagramm, Reihe enthält.&#10;&#10;KI-generierte Inhalte können fehlerhaft sein."/>
+            <wp:cNvGraphicFramePr>
+              <a:graphicFrameLocks xmlns:a="http://schemas.openxmlformats.org/drawingml/2006/main" noChangeAspect="1"/>
+            </wp:cNvGraphicFramePr>
+            <a:graphic xmlns:a="http://schemas.openxmlformats.org/drawingml/2006/main">
+              <a:graphicData uri="http://schemas.openxmlformats.org/drawingml/2006/picture">
+                <pic:pic xmlns:pic="http://schemas.openxmlformats.org/drawingml/2006/picture">
+                  <pic:nvPicPr>
+                    <pic:cNvPr id="1699520531" name="Grafik 1" descr="Ein Bild, das Text, Screenshot, Diagramm, Reihe enthält.&#10;&#10;KI-generierte Inhalte können fehlerhaft sein."/>
+                    <pic:cNvPicPr/>
+                  </pic:nvPicPr>
+                  <pic:blipFill>
+                    <a:blip r:embed="rId27"/>
+                    <a:stretch>
+                      <a:fillRect/>
+                    </a:stretch>
+                  </pic:blipFill>
+                  <pic:spPr>
+                    <a:xfrm>
+                      <a:off x="0" y="0"/>
+                      <a:ext cx="2340866" cy="1462526"/>
+                    </a:xfrm>
+                    <a:prstGeom prst="rect">
+                      <a:avLst/>
+                    </a:prstGeom>
+                  </pic:spPr>
+                </pic:pic>
+              </a:graphicData>
+            </a:graphic>
+          </wp:inline>
+        </w:drawing>
+      </w:r>
+    </w:p>
+    <w:p>
+      <w:pPr>
+        <w:numPr>
+          <w:ilvl w:val="1"/>
+          <w:numId w:val="45"/>
+        </w:numPr>
+      </w:pPr>
+      <w:commentRangeStart w:id="3"/>
+      <w:r>
+        <w:t xml:space="preserve">Gäbe es auch zu den Paaren </w:t>
+      </w:r>
+      <w:commentRangeEnd w:id="3"/>
+      <w:r>
+        <w:rPr>
+          <w:rStyle w:val="Kommentarzeichen"/>
+        </w:rPr>
+        <w:commentReference w:id="3"/>
+      </w:r>
+    </w:p>
+    <w:p>
+      <w:pPr>
+        <w:numPr>
+          <w:ilvl w:val="1"/>
+          <w:numId w:val="45"/>
+        </w:numPr>
+        <w:rPr>
+          <w:lang w:val="en-US"/>
+        </w:rPr>
+      </w:pPr>
+      <w:proofErr w:type="gramStart"/>
+      <w:r>
+        <w:t>!To</w:t>
+      </w:r>
+      <w:proofErr w:type="gramEnd"/>
+      <w:r>
+        <w:t xml:space="preserve"> do: Zu den Fenstergrößen und </w:t>
+      </w:r>
+      <w:proofErr w:type="spellStart"/>
+      <w:r>
+        <w:t>overlap</w:t>
+      </w:r>
+      <w:proofErr w:type="spellEnd"/>
+      <w:r>
+        <w:t xml:space="preserve"> informieren (aktuell </w:t>
+      </w:r>
+      <w:proofErr w:type="spellStart"/>
+      <w:r>
+        <w:t>window</w:t>
+      </w:r>
+      <w:proofErr w:type="spellEnd"/>
+      <w:r>
+        <w:t xml:space="preserve">=1mm, </w:t>
+      </w:r>
+      <w:proofErr w:type="spellStart"/>
+      <w:r>
+        <w:t>overlap</w:t>
+      </w:r>
+      <w:proofErr w:type="spellEnd"/>
+      <w:r>
+        <w:t xml:space="preserve">=0), </w:t>
+      </w:r>
+      <w:proofErr w:type="spellStart"/>
+      <w:r>
+        <w:t>Resoultion</w:t>
+      </w:r>
+      <w:proofErr w:type="spellEnd"/>
+      <w:r>
+        <w:t xml:space="preserve"> verliert auf 0.5mm </w:t>
+      </w:r>
+      <w:proofErr w:type="spellStart"/>
+      <w:r>
+        <w:t>wsl</w:t>
+      </w:r>
+      <w:proofErr w:type="spellEnd"/>
+      <w:r>
+        <w:t xml:space="preserve"> wegen Fenster-&gt;könnte diese verbessert werden? </w:t>
+      </w:r>
+      <w:r>
+        <w:rPr>
+          <w:lang w:val="en-US"/>
+        </w:rPr>
+        <w:t>In Löwe2012 Publication: 1,5,10mm window, increasing window smooths, no over</w:t>
+      </w:r>
+      <w:r>
+        <w:rPr>
+          <w:lang w:val="en-US"/>
+        </w:rPr>
+        <w:t xml:space="preserve">lapping(?) </w:t>
+      </w:r>
+    </w:p>
+    <w:p>
+      <w:pPr>
+        <w:numPr>
+          <w:ilvl w:val="1"/>
+          <w:numId w:val="45"/>
+        </w:numPr>
+      </w:pPr>
+      <w:r>
+        <w:t>Außerdem</w:t>
+      </w:r>
+      <w:r>
+        <w:t xml:space="preserve"> </w:t>
+      </w:r>
+      <w:r>
+        <w:t xml:space="preserve">im 2016er Datensatz ein paar Negative </w:t>
+      </w:r>
+      <w:proofErr w:type="spellStart"/>
+      <w:r>
+        <w:t>F_m</w:t>
+      </w:r>
+      <w:proofErr w:type="spellEnd"/>
+      <w:r>
+        <w:t xml:space="preserve"> Werte, wie we</w:t>
+      </w:r>
+      <w:r>
+        <w:t xml:space="preserve">rden die sonst gehandhabt? Sie führen zu lückenhafte </w:t>
+      </w:r>
+      <w:proofErr w:type="spellStart"/>
+      <w:r>
+        <w:t>darstellung</w:t>
+      </w:r>
+      <w:proofErr w:type="spellEnd"/>
+      <w:r>
+        <w:t xml:space="preserve"> im Plot (da Nan, aber kein großes Problem, spricht wahrscheinlich dafür das </w:t>
+      </w:r>
+      <w:proofErr w:type="gramStart"/>
+      <w:r>
+        <w:t>das Boden</w:t>
+      </w:r>
+      <w:proofErr w:type="gramEnd"/>
+      <w:r>
+        <w:t xml:space="preserve"> </w:t>
+      </w:r>
+      <w:proofErr w:type="gramStart"/>
+      <w:r>
+        <w:t>wär</w:t>
+      </w:r>
+      <w:proofErr w:type="gramEnd"/>
+      <w:r>
+        <w:t xml:space="preserve"> und dieser mit </w:t>
+      </w:r>
+      <w:proofErr w:type="spellStart"/>
+      <w:r>
+        <w:t>detect_ground</w:t>
+      </w:r>
+      <w:proofErr w:type="spellEnd"/>
+      <w:r>
+        <w:t xml:space="preserve"> zu spät erkannt wird) </w:t>
+      </w:r>
+      <w:r>
+        <w:t xml:space="preserve"> </w:t>
+      </w:r>
+    </w:p>
+    <w:p>
+      <w:pPr>
+        <w:numPr>
+          <w:ilvl w:val="1"/>
+          <w:numId w:val="45"/>
+        </w:numPr>
+      </w:pPr>
+      <w:r>
+        <w:t xml:space="preserve">Äquivalent für Schweiz </w:t>
+      </w:r>
+    </w:p>
+    <w:p>
+      <w:pPr>
+        <w:numPr>
+          <w:ilvl w:val="1"/>
+          <w:numId w:val="45"/>
+        </w:numPr>
+      </w:pPr>
+      <w:r>
+        <w:drawing>
+          <wp:inline distT="0" distB="0" distL="0" distR="0" wp14:anchorId="5E8158FB" wp14:editId="01523EAC">
+            <wp:extent cx="2129814" cy="1320570"/>
+            <wp:effectExtent l="0" t="0" r="3810" b="0"/>
+            <wp:docPr id="2139841084" name="Grafik 1" descr="Ein Bild, das Text, Diagramm, Screenshot, Reihe enthält.&#10;&#10;KI-generierte Inhalte können fehlerhaft sein."/>
+            <wp:cNvGraphicFramePr>
+              <a:graphicFrameLocks xmlns:a="http://schemas.openxmlformats.org/drawingml/2006/main" noChangeAspect="1"/>
+            </wp:cNvGraphicFramePr>
+            <a:graphic xmlns:a="http://schemas.openxmlformats.org/drawingml/2006/main">
+              <a:graphicData uri="http://schemas.openxmlformats.org/drawingml/2006/picture">
+                <pic:pic xmlns:pic="http://schemas.openxmlformats.org/drawingml/2006/picture">
+                  <pic:nvPicPr>
+                    <pic:cNvPr id="2139841084" name="Grafik 1" descr="Ein Bild, das Text, Diagramm, Screenshot, Reihe enthält.&#10;&#10;KI-generierte Inhalte können fehlerhaft sein."/>
+                    <pic:cNvPicPr/>
+                  </pic:nvPicPr>
+                  <pic:blipFill>
+                    <a:blip r:embed="rId28"/>
+                    <a:stretch>
+                      <a:fillRect/>
+                    </a:stretch>
+                  </pic:blipFill>
+                  <pic:spPr>
+                    <a:xfrm>
+                      <a:off x="0" y="0"/>
+                      <a:ext cx="2154017" cy="1335577"/>
+                    </a:xfrm>
+                    <a:prstGeom prst="rect">
+                      <a:avLst/>
+                    </a:prstGeom>
+                  </pic:spPr>
+                </pic:pic>
+              </a:graphicData>
+            </a:graphic>
+          </wp:inline>
+        </w:drawing>
+      </w:r>
+      <w:commentRangeStart w:id="4"/>
+      <w:r>
+        <w:drawing>
+          <wp:inline distT="0" distB="0" distL="0" distR="0" wp14:anchorId="6B725DC0" wp14:editId="55D4A0B9">
+            <wp:extent cx="1982146" cy="1247363"/>
+            <wp:effectExtent l="0" t="0" r="0" b="0"/>
+            <wp:docPr id="972800682" name="Grafik 1" descr="Ein Bild, das Text, Screenshot, Diagramm, Reihe enthält.&#10;&#10;KI-generierte Inhalte können fehlerhaft sein."/>
+            <wp:cNvGraphicFramePr>
+              <a:graphicFrameLocks xmlns:a="http://schemas.openxmlformats.org/drawingml/2006/main" noChangeAspect="1"/>
+            </wp:cNvGraphicFramePr>
+            <a:graphic xmlns:a="http://schemas.openxmlformats.org/drawingml/2006/main">
+              <a:graphicData uri="http://schemas.openxmlformats.org/drawingml/2006/picture">
+                <pic:pic xmlns:pic="http://schemas.openxmlformats.org/drawingml/2006/picture">
+                  <pic:nvPicPr>
+                    <pic:cNvPr id="972800682" name="Grafik 1" descr="Ein Bild, das Text, Screenshot, Diagramm, Reihe enthält.&#10;&#10;KI-generierte Inhalte können fehlerhaft sein."/>
+                    <pic:cNvPicPr/>
+                  </pic:nvPicPr>
+                  <pic:blipFill>
+                    <a:blip r:embed="rId29"/>
+                    <a:stretch>
+                      <a:fillRect/>
+                    </a:stretch>
+                  </pic:blipFill>
+                  <pic:spPr>
+                    <a:xfrm>
+                      <a:off x="0" y="0"/>
+                      <a:ext cx="1998281" cy="1257517"/>
+                    </a:xfrm>
+                    <a:prstGeom prst="rect">
+                      <a:avLst/>
+                    </a:prstGeom>
+                  </pic:spPr>
+                </pic:pic>
+              </a:graphicData>
+            </a:graphic>
+          </wp:inline>
+        </w:drawing>
+      </w:r>
+      <w:commentRangeEnd w:id="4"/>
+      <w:r>
+        <w:rPr>
+          <w:rStyle w:val="Kommentarzeichen"/>
+        </w:rPr>
+        <w:commentReference w:id="4"/>
+      </w:r>
+      <w:r>
+        <w:drawing>
+          <wp:inline distT="0" distB="0" distL="0" distR="0" wp14:anchorId="1213264E" wp14:editId="3D997227">
+            <wp:extent cx="1446046" cy="908720"/>
+            <wp:effectExtent l="0" t="0" r="1905" b="5715"/>
+            <wp:docPr id="1126626491" name="Grafik 1" descr="Ein Bild, das Text, Diagramm, Screenshot, Reihe enthält.&#10;&#10;KI-generierte Inhalte können fehlerhaft sein."/>
+            <wp:cNvGraphicFramePr>
+              <a:graphicFrameLocks xmlns:a="http://schemas.openxmlformats.org/drawingml/2006/main" noChangeAspect="1"/>
+            </wp:cNvGraphicFramePr>
+            <a:graphic xmlns:a="http://schemas.openxmlformats.org/drawingml/2006/main">
+              <a:graphicData uri="http://schemas.openxmlformats.org/drawingml/2006/picture">
+                <pic:pic xmlns:pic="http://schemas.openxmlformats.org/drawingml/2006/picture">
+                  <pic:nvPicPr>
+                    <pic:cNvPr id="1126626491" name="Grafik 1" descr="Ein Bild, das Text, Diagramm, Screenshot, Reihe enthält.&#10;&#10;KI-generierte Inhalte können fehlerhaft sein."/>
+                    <pic:cNvPicPr/>
+                  </pic:nvPicPr>
+                  <pic:blipFill>
+                    <a:blip r:embed="rId30"/>
+                    <a:stretch>
+                      <a:fillRect/>
+                    </a:stretch>
+                  </pic:blipFill>
+                  <pic:spPr>
+                    <a:xfrm>
+                      <a:off x="0" y="0"/>
+                      <a:ext cx="1464183" cy="920118"/>
+                    </a:xfrm>
+                    <a:prstGeom prst="rect">
+                      <a:avLst/>
+                    </a:prstGeom>
+                  </pic:spPr>
+                </pic:pic>
+              </a:graphicData>
+            </a:graphic>
+          </wp:inline>
+        </w:drawing>
       </w:r>
     </w:p>
     <w:p>
@@ -10030,7 +10655,6 @@
         </w:numPr>
       </w:pPr>
       <w:r>
-        <w:lastRenderedPageBreak/>
         <w:t>Validierung auch für Schweizer Datensatz</w:t>
       </w:r>
       <w:r>
@@ -10209,6 +10833,7 @@
         </w:numPr>
       </w:pPr>
       <w:r>
+        <w:lastRenderedPageBreak/>
         <w:t>Methode könnte weiter verbessert werden, oder auch lernen auf großem Datensatz möglich</w:t>
       </w:r>
     </w:p>
@@ -10350,19 +10975,11 @@
           <w:lang w:val="en-US"/>
         </w:rPr>
       </w:pPr>
-      <w:proofErr w:type="spellStart"/>
-      <w:r>
-        <w:rPr>
-          <w:lang w:val="en-US"/>
-        </w:rPr>
-        <w:t>Ermöglicht</w:t>
-      </w:r>
-      <w:proofErr w:type="spellEnd"/>
-      <w:r>
-        <w:rPr>
-          <w:lang w:val="en-US"/>
-        </w:rPr>
-        <w:t xml:space="preserve"> </w:t>
+      <w:r>
+        <w:rPr>
+          <w:lang w:val="en-US"/>
+        </w:rPr>
+        <w:t xml:space="preserve">Ermöglicht </w:t>
       </w:r>
       <w:proofErr w:type="spellStart"/>
       <w:r>
@@ -10450,7 +11067,15 @@
       </w:r>
       <w:proofErr w:type="spellEnd"/>
       <w:r>
-        <w:t xml:space="preserve"> Wert kann gemittelt werden, Grenze nicht ganz objektiv gesetzt, kann sich bei </w:t>
+        <w:t xml:space="preserve"> Wert </w:t>
+      </w:r>
+      <w:proofErr w:type="gramStart"/>
+      <w:r>
+        <w:t>kann</w:t>
+      </w:r>
+      <w:proofErr w:type="gramEnd"/>
+      <w:r>
+        <w:t xml:space="preserve"> gemittelt werden, Grenze nicht ganz objektiv gesetzt, kann sich bei </w:t>
       </w:r>
       <w:proofErr w:type="spellStart"/>
       <w:r>
@@ -10726,7 +11351,6 @@
         </w:numPr>
       </w:pPr>
       <w:r>
-        <w:lastRenderedPageBreak/>
         <w:t>Forschungsfrage 1: Die Oberflächendetektion konnte durch den neuen Algorithmus deutlich verbessert werden.</w:t>
       </w:r>
     </w:p>
@@ -10820,6 +11444,7 @@
         </w:numPr>
       </w:pPr>
       <w:r>
+        <w:lastRenderedPageBreak/>
         <w:t>Dichte dient dabei als exemplarischer Zielparameter – Methoden sind aber übertragbar.</w:t>
       </w:r>
     </w:p>
@@ -10920,8 +11545,13 @@
         </w:numPr>
       </w:pPr>
       <w:r>
-        <w:t>Automatisches Verfahren einbinden in ?</w:t>
-      </w:r>
+        <w:t xml:space="preserve">Automatisches Verfahren einbinden </w:t>
+      </w:r>
+      <w:proofErr w:type="gramStart"/>
+      <w:r>
+        <w:t>in ?</w:t>
+      </w:r>
+      <w:proofErr w:type="gramEnd"/>
     </w:p>
     <w:p>
       <w:pPr>
@@ -11037,8 +11667,16 @@
         <w:rPr>
           <w:lang w:val="en-US"/>
         </w:rPr>
-        <w:t>, Parameterlisten</w:t>
-      </w:r>
+        <w:t xml:space="preserve">, </w:t>
+      </w:r>
+      <w:proofErr w:type="spellStart"/>
+      <w:r>
+        <w:rPr>
+          <w:lang w:val="en-US"/>
+        </w:rPr>
+        <w:t>Parameterlisten</w:t>
+      </w:r>
+      <w:proofErr w:type="spellEnd"/>
     </w:p>
     <w:p>
       <w:pPr>
@@ -11161,6 +11799,46 @@
       </w:r>
     </w:p>
   </w:comment>
+  <w:comment w:id="3" w:author="Jil Christin Lehnert" w:date="2025-08-05T14:41:00Z" w:initials="JL">
+    <w:p>
+      <w:pPr>
+        <w:pStyle w:val="Kommentartext"/>
+      </w:pPr>
+      <w:r>
+        <w:rPr>
+          <w:rStyle w:val="Kommentarzeichen"/>
+        </w:rPr>
+        <w:annotationRef/>
+      </w:r>
+      <w:r>
+        <w:t>Möchte ich das als Ergebnis Plots mit aufnehmen? Eigentlich ist ein Mittel aus zwei Profilen ja wahrscheinlich nicht so extrem aussagekräftig, allerding hat es sehr starke ähnlichkeitswerte</w:t>
+      </w:r>
+    </w:p>
+    <w:p>
+      <w:pPr>
+        <w:pStyle w:val="Kommentartext"/>
+      </w:pPr>
+      <w:r>
+        <w:br/>
+      </w:r>
+    </w:p>
+  </w:comment>
+  <w:comment w:id="4" w:author="Jil Christin Lehnert" w:date="2025-08-05T14:41:00Z" w:initials="JL">
+    <w:p>
+      <w:pPr>
+        <w:pStyle w:val="Kommentartext"/>
+      </w:pPr>
+      <w:r>
+        <w:rPr>
+          <w:rStyle w:val="Kommentarzeichen"/>
+        </w:rPr>
+        <w:annotationRef/>
+      </w:r>
+      <w:r>
+        <w:t>Hier wäre wahrscheinlich interessant (villeicht auch erst für die Diskussion) der Tag an dem die Ähnlichkeit bei allen so hoch war ob es dadurch ein besseres Mittel gibt</w:t>
+      </w:r>
+    </w:p>
+  </w:comment>
 </w:comments>
 </file>
 
@@ -11169,6 +11847,8 @@
   <w15:commentEx w15:paraId="4DFEDCE9" w15:done="0"/>
   <w15:commentEx w15:paraId="73CA72D9" w15:done="0"/>
   <w15:commentEx w15:paraId="7E8FF42B" w15:done="0"/>
+  <w15:commentEx w15:paraId="42BD11F7" w15:done="0"/>
+  <w15:commentEx w15:paraId="54D4BDC8" w15:done="0"/>
 </w15:commentsEx>
 </file>
 
@@ -11177,6 +11857,8 @@
   <w16cex:commentExtensible w16cex:durableId="0851C8E2" w16cex:dateUtc="2025-07-30T10:05:00Z"/>
   <w16cex:commentExtensible w16cex:durableId="5827E362" w16cex:dateUtc="2025-08-04T12:42:00Z"/>
   <w16cex:commentExtensible w16cex:durableId="1C181B97" w16cex:dateUtc="2025-07-30T11:59:00Z"/>
+  <w16cex:commentExtensible w16cex:durableId="5BD56A24" w16cex:dateUtc="2025-08-05T12:41:00Z"/>
+  <w16cex:commentExtensible w16cex:durableId="158BE313" w16cex:dateUtc="2025-08-05T12:41:00Z"/>
 </w16cex:commentsExtensible>
 </file>
 
@@ -11185,6 +11867,8 @@
   <w16cid:commentId w16cid:paraId="4DFEDCE9" w16cid:durableId="0851C8E2"/>
   <w16cid:commentId w16cid:paraId="73CA72D9" w16cid:durableId="5827E362"/>
   <w16cid:commentId w16cid:paraId="7E8FF42B" w16cid:durableId="1C181B97"/>
+  <w16cid:commentId w16cid:paraId="42BD11F7" w16cid:durableId="5BD56A24"/>
+  <w16cid:commentId w16cid:paraId="54D4BDC8" w16cid:durableId="158BE313"/>
 </w16cid:commentsIds>
 </file>
 

</xml_diff>

<commit_message>
manual density for snowpro and densitycutter with mean
</commit_message>
<xml_diff>
--- a/output/masterthesis/Struktur_Masterarbeit.docx
+++ b/output/masterthesis/Struktur_Masterarbeit.docx
@@ -10211,6 +10211,9 @@
         <w:t>lot</w:t>
       </w:r>
       <w:r>
+        <w:rPr>
+          <w:noProof/>
+        </w:rPr>
         <w:drawing>
           <wp:inline distT="0" distB="0" distL="0" distR="0" wp14:anchorId="74CA01F8" wp14:editId="7F8C05C4">
             <wp:extent cx="2232045" cy="1426274"/>
@@ -10248,6 +10251,9 @@
         </w:drawing>
       </w:r>
       <w:r>
+        <w:rPr>
+          <w:noProof/>
+        </w:rPr>
         <w:drawing>
           <wp:inline distT="0" distB="0" distL="0" distR="0" wp14:anchorId="4C2AD488" wp14:editId="61120F47">
             <wp:extent cx="2327145" cy="1453953"/>
@@ -10457,6 +10463,9 @@
         </w:numPr>
       </w:pPr>
       <w:r>
+        <w:rPr>
+          <w:noProof/>
+        </w:rPr>
         <w:drawing>
           <wp:inline distT="0" distB="0" distL="0" distR="0" wp14:anchorId="5E8158FB" wp14:editId="01523EAC">
             <wp:extent cx="2129814" cy="1320570"/>
@@ -10495,6 +10504,9 @@
       </w:r>
       <w:commentRangeStart w:id="4"/>
       <w:r>
+        <w:rPr>
+          <w:noProof/>
+        </w:rPr>
         <w:drawing>
           <wp:inline distT="0" distB="0" distL="0" distR="0" wp14:anchorId="6B725DC0" wp14:editId="55D4A0B9">
             <wp:extent cx="1982146" cy="1247363"/>
@@ -10539,6 +10551,9 @@
         <w:commentReference w:id="4"/>
       </w:r>
       <w:r>
+        <w:rPr>
+          <w:noProof/>
+        </w:rPr>
         <w:drawing>
           <wp:inline distT="0" distB="0" distL="0" distR="0" wp14:anchorId="1213264E" wp14:editId="3D997227">
             <wp:extent cx="1446046" cy="908720"/>
@@ -10663,6 +10678,161 @@
     </w:p>
     <w:p>
       <w:pPr>
+        <w:numPr>
+          <w:ilvl w:val="0"/>
+          <w:numId w:val="46"/>
+        </w:numPr>
+      </w:pPr>
+      <w:r>
+        <w:t xml:space="preserve">Tirol: </w:t>
+      </w:r>
+    </w:p>
+    <w:p>
+      <w:pPr>
+        <w:ind w:left="720"/>
+      </w:pPr>
+      <w:r>
+        <w:lastRenderedPageBreak/>
+        <w:drawing>
+          <wp:inline distT="0" distB="0" distL="0" distR="0" wp14:anchorId="60BCC741" wp14:editId="53B716DB">
+            <wp:extent cx="2518994" cy="1572427"/>
+            <wp:effectExtent l="0" t="0" r="0" b="8890"/>
+            <wp:docPr id="373255589" name="Grafik 1"/>
+            <wp:cNvGraphicFramePr>
+              <a:graphicFrameLocks xmlns:a="http://schemas.openxmlformats.org/drawingml/2006/main" noChangeAspect="1"/>
+            </wp:cNvGraphicFramePr>
+            <a:graphic xmlns:a="http://schemas.openxmlformats.org/drawingml/2006/main">
+              <a:graphicData uri="http://schemas.openxmlformats.org/drawingml/2006/picture">
+                <pic:pic xmlns:pic="http://schemas.openxmlformats.org/drawingml/2006/picture">
+                  <pic:nvPicPr>
+                    <pic:cNvPr id="373255589" name=""/>
+                    <pic:cNvPicPr/>
+                  </pic:nvPicPr>
+                  <pic:blipFill>
+                    <a:blip r:embed="rId31"/>
+                    <a:stretch>
+                      <a:fillRect/>
+                    </a:stretch>
+                  </pic:blipFill>
+                  <pic:spPr>
+                    <a:xfrm>
+                      <a:off x="0" y="0"/>
+                      <a:ext cx="2531513" cy="1580242"/>
+                    </a:xfrm>
+                    <a:prstGeom prst="rect">
+                      <a:avLst/>
+                    </a:prstGeom>
+                  </pic:spPr>
+                </pic:pic>
+              </a:graphicData>
+            </a:graphic>
+          </wp:inline>
+        </w:drawing>
+      </w:r>
+      <w:commentRangeStart w:id="5"/>
+      <w:r>
+        <w:drawing>
+          <wp:inline distT="0" distB="0" distL="0" distR="0" wp14:anchorId="04EC76D2" wp14:editId="4B2F37E3">
+            <wp:extent cx="2649425" cy="1666988"/>
+            <wp:effectExtent l="0" t="0" r="0" b="0"/>
+            <wp:docPr id="2049063341" name="Grafik 1" descr="Ein Bild, das Text, Diagramm, Reihe, Schrift enthält.&#10;&#10;KI-generierte Inhalte können fehlerhaft sein."/>
+            <wp:cNvGraphicFramePr>
+              <a:graphicFrameLocks xmlns:a="http://schemas.openxmlformats.org/drawingml/2006/main" noChangeAspect="1"/>
+            </wp:cNvGraphicFramePr>
+            <a:graphic xmlns:a="http://schemas.openxmlformats.org/drawingml/2006/main">
+              <a:graphicData uri="http://schemas.openxmlformats.org/drawingml/2006/picture">
+                <pic:pic xmlns:pic="http://schemas.openxmlformats.org/drawingml/2006/picture">
+                  <pic:nvPicPr>
+                    <pic:cNvPr id="2049063341" name="Grafik 1" descr="Ein Bild, das Text, Diagramm, Reihe, Schrift enthält.&#10;&#10;KI-generierte Inhalte können fehlerhaft sein."/>
+                    <pic:cNvPicPr/>
+                  </pic:nvPicPr>
+                  <pic:blipFill>
+                    <a:blip r:embed="rId32"/>
+                    <a:stretch>
+                      <a:fillRect/>
+                    </a:stretch>
+                  </pic:blipFill>
+                  <pic:spPr>
+                    <a:xfrm>
+                      <a:off x="0" y="0"/>
+                      <a:ext cx="2660122" cy="1673718"/>
+                    </a:xfrm>
+                    <a:prstGeom prst="rect">
+                      <a:avLst/>
+                    </a:prstGeom>
+                  </pic:spPr>
+                </pic:pic>
+              </a:graphicData>
+            </a:graphic>
+          </wp:inline>
+        </w:drawing>
+      </w:r>
+      <w:commentRangeEnd w:id="5"/>
+      <w:r>
+        <w:rPr>
+          <w:rStyle w:val="Kommentarzeichen"/>
+        </w:rPr>
+        <w:commentReference w:id="5"/>
+      </w:r>
+    </w:p>
+    <w:p>
+      <w:pPr>
+        <w:numPr>
+          <w:ilvl w:val="0"/>
+          <w:numId w:val="46"/>
+        </w:numPr>
+      </w:pPr>
+      <w:r>
+        <w:t xml:space="preserve">Schweiz: </w:t>
+      </w:r>
+      <w:commentRangeStart w:id="6"/>
+      <w:r>
+        <w:drawing>
+          <wp:inline distT="0" distB="0" distL="0" distR="0" wp14:anchorId="519D9DD7" wp14:editId="545818EE">
+            <wp:extent cx="3822782" cy="2396824"/>
+            <wp:effectExtent l="0" t="0" r="6350" b="3810"/>
+            <wp:docPr id="1447218672" name="Grafik 1"/>
+            <wp:cNvGraphicFramePr>
+              <a:graphicFrameLocks xmlns:a="http://schemas.openxmlformats.org/drawingml/2006/main" noChangeAspect="1"/>
+            </wp:cNvGraphicFramePr>
+            <a:graphic xmlns:a="http://schemas.openxmlformats.org/drawingml/2006/main">
+              <a:graphicData uri="http://schemas.openxmlformats.org/drawingml/2006/picture">
+                <pic:pic xmlns:pic="http://schemas.openxmlformats.org/drawingml/2006/picture">
+                  <pic:nvPicPr>
+                    <pic:cNvPr id="1447218672" name=""/>
+                    <pic:cNvPicPr/>
+                  </pic:nvPicPr>
+                  <pic:blipFill>
+                    <a:blip r:embed="rId33"/>
+                    <a:stretch>
+                      <a:fillRect/>
+                    </a:stretch>
+                  </pic:blipFill>
+                  <pic:spPr>
+                    <a:xfrm>
+                      <a:off x="0" y="0"/>
+                      <a:ext cx="3838598" cy="2406740"/>
+                    </a:xfrm>
+                    <a:prstGeom prst="rect">
+                      <a:avLst/>
+                    </a:prstGeom>
+                  </pic:spPr>
+                </pic:pic>
+              </a:graphicData>
+            </a:graphic>
+          </wp:inline>
+        </w:drawing>
+      </w:r>
+      <w:commentRangeEnd w:id="6"/>
+      <w:r>
+        <w:rPr>
+          <w:rStyle w:val="Kommentarzeichen"/>
+        </w:rPr>
+        <w:commentReference w:id="6"/>
+      </w:r>
+    </w:p>
+    <w:p>
+      <w:pPr>
         <w:rPr>
           <w:b/>
           <w:bCs/>
@@ -10833,7 +11003,6 @@
         </w:numPr>
       </w:pPr>
       <w:r>
-        <w:lastRenderedPageBreak/>
         <w:t>Methode könnte weiter verbessert werden, oder auch lernen auf großem Datensatz möglich</w:t>
       </w:r>
     </w:p>
@@ -11059,6 +11228,7 @@
         </w:numPr>
       </w:pPr>
       <w:r>
+        <w:lastRenderedPageBreak/>
         <w:t xml:space="preserve">Auch wichtig bis zu welchem </w:t>
       </w:r>
       <w:proofErr w:type="spellStart"/>
@@ -11444,7 +11614,6 @@
         </w:numPr>
       </w:pPr>
       <w:r>
-        <w:lastRenderedPageBreak/>
         <w:t>Dichte dient dabei als exemplarischer Zielparameter – Methoden sind aber übertragbar.</w:t>
       </w:r>
     </w:p>
@@ -11627,6 +11796,7 @@
           <w:bCs/>
           <w:lang w:val="en-US"/>
         </w:rPr>
+        <w:lastRenderedPageBreak/>
         <w:t>Anhang</w:t>
       </w:r>
       <w:proofErr w:type="spellEnd"/>
@@ -11839,6 +12009,38 @@
       </w:r>
     </w:p>
   </w:comment>
+  <w:comment w:id="5" w:author="Jil Christin Lehnert" w:date="2025-08-06T14:07:00Z" w:initials="JL">
+    <w:p>
+      <w:pPr>
+        <w:pStyle w:val="Kommentartext"/>
+      </w:pPr>
+      <w:r>
+        <w:rPr>
+          <w:rStyle w:val="Kommentarzeichen"/>
+        </w:rPr>
+        <w:annotationRef/>
+      </w:r>
+      <w:r>
+        <w:t>Hier habe ich diese Steigung drin wo es keinen Wert gibt, das könnte man evtl. noch entfernen</w:t>
+      </w:r>
+    </w:p>
+  </w:comment>
+  <w:comment w:id="6" w:author="Jil Christin Lehnert" w:date="2025-08-06T11:33:00Z" w:initials="JL">
+    <w:p>
+      <w:pPr>
+        <w:pStyle w:val="Kommentartext"/>
+      </w:pPr>
+      <w:r>
+        <w:rPr>
+          <w:rStyle w:val="Kommentarzeichen"/>
+        </w:rPr>
+        <w:annotationRef/>
+      </w:r>
+      <w:r>
+        <w:t xml:space="preserve">Ich könnte hier auch noch die Pair means dazuplotten aktuell ist nur gloabl mean (reicht aber auch) </w:t>
+      </w:r>
+    </w:p>
+  </w:comment>
 </w:comments>
 </file>
 
@@ -11849,6 +12051,8 @@
   <w15:commentEx w15:paraId="7E8FF42B" w15:done="0"/>
   <w15:commentEx w15:paraId="42BD11F7" w15:done="0"/>
   <w15:commentEx w15:paraId="54D4BDC8" w15:done="0"/>
+  <w15:commentEx w15:paraId="6D7FD75A" w15:done="0"/>
+  <w15:commentEx w15:paraId="52C14E0F" w15:done="0"/>
 </w15:commentsEx>
 </file>
 
@@ -11859,6 +12063,8 @@
   <w16cex:commentExtensible w16cex:durableId="1C181B97" w16cex:dateUtc="2025-07-30T11:59:00Z"/>
   <w16cex:commentExtensible w16cex:durableId="5BD56A24" w16cex:dateUtc="2025-08-05T12:41:00Z"/>
   <w16cex:commentExtensible w16cex:durableId="158BE313" w16cex:dateUtc="2025-08-05T12:41:00Z"/>
+  <w16cex:commentExtensible w16cex:durableId="51875925" w16cex:dateUtc="2025-08-06T12:07:00Z"/>
+  <w16cex:commentExtensible w16cex:durableId="125EA467" w16cex:dateUtc="2025-08-06T09:33:00Z"/>
 </w16cex:commentsExtensible>
 </file>
 
@@ -11869,6 +12075,8 @@
   <w16cid:commentId w16cid:paraId="7E8FF42B" w16cid:durableId="1C181B97"/>
   <w16cid:commentId w16cid:paraId="42BD11F7" w16cid:durableId="5BD56A24"/>
   <w16cid:commentId w16cid:paraId="54D4BDC8" w16cid:durableId="158BE313"/>
+  <w16cid:commentId w16cid:paraId="6D7FD75A" w16cid:durableId="51875925"/>
+  <w16cid:commentId w16cid:paraId="52C14E0F" w16cid:durableId="125EA467"/>
 </w16cid:commentsIds>
 </file>
 

</xml_diff>

<commit_message>
calculating and printing mean density over total distance SMP
</commit_message>
<xml_diff>
--- a/output/masterthesis/Struktur_Masterarbeit.docx
+++ b/output/masterthesis/Struktur_Masterarbeit.docx
@@ -53,19 +53,8 @@
           <w:color w:val="EE0000"/>
           <w:lang w:val="en-US"/>
         </w:rPr>
-        <w:t xml:space="preserve"> Signals</w:t>
-      </w:r>
-      <w:proofErr w:type="gramStart"/>
-      <w:r>
-        <w:rPr>
-          <w:b/>
-          <w:bCs/>
-          <w:color w:val="EE0000"/>
-          <w:lang w:val="en-US"/>
-        </w:rPr>
-        <w:t xml:space="preserve"> ..?</w:t>
-      </w:r>
-      <w:proofErr w:type="gramEnd"/>
+        <w:t xml:space="preserve"> Signals ..?</w:t>
+      </w:r>
     </w:p>
     <w:p>
       <w:pPr>
@@ -395,18 +384,10 @@
         </w:numPr>
       </w:pPr>
       <w:r>
-        <w:t xml:space="preserve">Übergang zur automatisierten </w:t>
-      </w:r>
-      <w:proofErr w:type="gramStart"/>
-      <w:r>
-        <w:t xml:space="preserve">Messung </w:t>
-      </w:r>
-      <w:r>
-        <w:t xml:space="preserve"> (</w:t>
-      </w:r>
-      <w:proofErr w:type="gramEnd"/>
-      <w:r>
-        <w:t>Rammsonde</w:t>
+        <w:t xml:space="preserve">Übergang zur automatisierten Messung </w:t>
+      </w:r>
+      <w:r>
+        <w:t xml:space="preserve"> (Rammsonde</w:t>
       </w:r>
       <w:r>
         <w:t xml:space="preserve">, </w:t>
@@ -423,18 +404,10 @@
         <w:t xml:space="preserve">), </w:t>
       </w:r>
       <w:r>
-        <w:t xml:space="preserve">Radar </w:t>
-      </w:r>
-      <w:proofErr w:type="gramStart"/>
-      <w:r>
-        <w:t xml:space="preserve">&gt; </w:t>
-      </w:r>
-      <w:r>
-        <w:t xml:space="preserve"> zu</w:t>
-      </w:r>
-      <w:proofErr w:type="gramEnd"/>
-      <w:r>
-        <w:t xml:space="preserve"> schlecht </w:t>
+        <w:t xml:space="preserve">Radar &gt; </w:t>
+      </w:r>
+      <w:r>
+        <w:t xml:space="preserve"> zu schlecht </w:t>
       </w:r>
       <w:r>
         <w:t xml:space="preserve">und </w:t>
@@ -1366,21 +1339,7 @@
         <w:rPr>
           <w:lang w:val="en-US"/>
         </w:rPr>
-        <w:t xml:space="preserve"> </w:t>
-      </w:r>
-      <w:proofErr w:type="gramStart"/>
-      <w:r>
-        <w:rPr>
-          <w:lang w:val="en-US"/>
-        </w:rPr>
-        <w:t>( von</w:t>
-      </w:r>
-      <w:proofErr w:type="gramEnd"/>
-      <w:r>
-        <w:rPr>
-          <w:lang w:val="en-US"/>
-        </w:rPr>
-        <w:t xml:space="preserve"> .</w:t>
+        <w:t xml:space="preserve"> ( von .</w:t>
       </w:r>
       <w:proofErr w:type="spellStart"/>
       <w:r>
@@ -2670,16 +2629,11 @@
     </w:p>
     <w:p>
       <w:r>
-        <w:t>Fotos mit Markierungen vom Messaufbau</w:t>
-      </w:r>
-      <w:proofErr w:type="gramStart"/>
-      <w:r>
-        <w:t xml:space="preserve"> </w:t>
+        <w:t xml:space="preserve">Fotos mit Markierungen vom Messaufbau </w:t>
       </w:r>
       <w:r>
         <w:t>..</w:t>
       </w:r>
-      <w:proofErr w:type="gramEnd"/>
     </w:p>
     <w:tbl>
       <w:tblPr>
@@ -4157,21 +4111,8 @@
         <w:t>Nicht im Datensatz aber v</w:t>
       </w:r>
       <w:r>
-        <w:t xml:space="preserve">eröffentlicht auf Schneeprofilseite des SLF: Händische Schneeprofile von der gleichen </w:t>
-      </w:r>
-      <w:proofErr w:type="gramStart"/>
-      <w:r>
-        <w:t>Test Site</w:t>
-      </w:r>
-      <w:proofErr w:type="gramEnd"/>
-      <w:r>
-        <w:t xml:space="preserve">, alle zwei Wochen, Tag überschneidet sich für die </w:t>
-      </w:r>
-      <w:proofErr w:type="gramStart"/>
-      <w:r>
-        <w:t>SMP Messung</w:t>
-      </w:r>
-      <w:proofErr w:type="gramEnd"/>
+        <w:t>eröffentlicht auf Schneeprofilseite des SLF: Händische Schneeprofile von der gleichen Test Site, alle zwei Wochen, Tag überschneidet sich für die SMP Messung</w:t>
+      </w:r>
       <w:r>
         <w:t>, beinhalten D</w:t>
       </w:r>
@@ -4196,15 +4137,7 @@
         <w:t>i</w:t>
       </w:r>
       <w:r>
-        <w:t xml:space="preserve">ch für Validierung von meiner Methode später verwende, mit zugehörigen </w:t>
-      </w:r>
-      <w:proofErr w:type="gramStart"/>
-      <w:r>
-        <w:t>SMP Datensätzen</w:t>
-      </w:r>
-      <w:proofErr w:type="gramEnd"/>
-      <w:r>
-        <w:t xml:space="preserve"> </w:t>
+        <w:t xml:space="preserve">ch für Validierung von meiner Methode später verwende, mit zugehörigen SMP Datensätzen </w:t>
       </w:r>
     </w:p>
     <w:p>
@@ -4838,18 +4771,10 @@
     </w:p>
     <w:p>
       <w:r>
-        <w:t xml:space="preserve">Die folgenden Methoden werden </w:t>
-      </w:r>
-      <w:proofErr w:type="gramStart"/>
-      <w:r>
-        <w:t>v</w:t>
-      </w:r>
-      <w:r>
-        <w:t>orgestellt</w:t>
-      </w:r>
-      <w:proofErr w:type="gramEnd"/>
-      <w:r>
-        <w:t xml:space="preserve"> um das Signal zu verarbeiten: </w:t>
+        <w:t>Die folgenden Methoden werden v</w:t>
+      </w:r>
+      <w:r>
+        <w:t xml:space="preserve">orgestellt um das Signal zu verarbeiten: </w:t>
       </w:r>
       <w:proofErr w:type="spellStart"/>
       <w:r>
@@ -5112,12 +5037,10 @@
         <w:t xml:space="preserve"> via </w:t>
       </w:r>
       <w:proofErr w:type="spellStart"/>
-      <w:proofErr w:type="gramStart"/>
       <w:r>
         <w:t>numpy.gradient</w:t>
       </w:r>
       <w:proofErr w:type="spellEnd"/>
-      <w:proofErr w:type="gramEnd"/>
       <w:r>
         <w:t>(), Standardabweichung als Schwellwertbasis</w:t>
       </w:r>
@@ -5885,28 +5808,14 @@
         <w:rPr>
           <w:lang w:val="en-US"/>
         </w:rPr>
-        <w:t>autodetect_</w:t>
-      </w:r>
-      <w:proofErr w:type="gramStart"/>
-      <w:r>
-        <w:rPr>
-          <w:lang w:val="en-US"/>
-        </w:rPr>
-        <w:t>ground</w:t>
-      </w:r>
-      <w:proofErr w:type="spellEnd"/>
-      <w:r>
-        <w:rPr>
-          <w:lang w:val="en-US"/>
-        </w:rPr>
-        <w:t>(</w:t>
-      </w:r>
-      <w:proofErr w:type="gramEnd"/>
-      <w:r>
-        <w:rPr>
-          <w:lang w:val="en-US"/>
-        </w:rPr>
-        <w:t>) (</w:t>
+        <w:t>autodetect_ground</w:t>
+      </w:r>
+      <w:proofErr w:type="spellEnd"/>
+      <w:r>
+        <w:rPr>
+          <w:lang w:val="en-US"/>
+        </w:rPr>
+        <w:t>() (</w:t>
       </w:r>
       <w:proofErr w:type="spellStart"/>
       <w:r>
@@ -6612,14 +6521,9 @@
           <w:numId w:val="31"/>
         </w:numPr>
       </w:pPr>
-      <w:proofErr w:type="gramStart"/>
       <w:r>
         <w:lastRenderedPageBreak/>
-        <w:t>Finde</w:t>
-      </w:r>
-      <w:proofErr w:type="gramEnd"/>
-      <w:r>
-        <w:t xml:space="preserve"> alle möglichen Kombinationsgruppen, in denen Threshold erfüllt wird in allen Nebendiagonalen</w:t>
+        <w:t>Finde alle möglichen Kombinationsgruppen, in denen Threshold erfüllt wird in allen Nebendiagonalen</w:t>
       </w:r>
     </w:p>
     <w:p>
@@ -7014,18 +6918,10 @@
         <w:t xml:space="preserve"> einfügen</w:t>
       </w:r>
       <w:r>
-        <w:t xml:space="preserve"> das Schritte </w:t>
-      </w:r>
-      <w:proofErr w:type="gramStart"/>
-      <w:r>
-        <w:t xml:space="preserve">darstellt </w:t>
-      </w:r>
-      <w:r>
-        <w:t>,</w:t>
-      </w:r>
-      <w:proofErr w:type="gramEnd"/>
-      <w:r>
-        <w:t xml:space="preserve"> z.</w:t>
+        <w:t xml:space="preserve"> das Schritte darstellt </w:t>
+      </w:r>
+      <w:r>
+        <w:t>, z.</w:t>
       </w:r>
       <w:r>
         <w:rPr>
@@ -7985,16 +7881,11 @@
         <w:t xml:space="preserve"> </w:t>
       </w:r>
       <w:r>
-        <w:t xml:space="preserve">Dichteprofile nebeneinander: Einzelprofil vs. </w:t>
-      </w:r>
-      <w:proofErr w:type="gramStart"/>
-      <w:r>
-        <w:t>Mittelprofil</w:t>
+        <w:t>Dichteprofile nebeneinander: Einzelprofil vs. Mittelprofil</w:t>
       </w:r>
       <w:r>
         <w:t>..</w:t>
       </w:r>
-      <w:proofErr w:type="gramEnd"/>
     </w:p>
     <w:p>
       <w:pPr>
@@ -8105,16 +7996,11 @@
       </w:r>
       <w:proofErr w:type="spellEnd"/>
       <w:r>
-        <w:t xml:space="preserve"> </w:t>
-      </w:r>
-      <w:proofErr w:type="gramStart"/>
-      <w:r>
-        <w:t>( 28</w:t>
+        <w:t xml:space="preserve"> ( 28</w:t>
       </w:r>
       <w:r>
         <w:t>16</w:t>
       </w:r>
-      <w:proofErr w:type="gramEnd"/>
       <w:r>
         <w:t xml:space="preserve"> Profile mit manuell gesetztem Surface)</w:t>
       </w:r>
@@ -8414,15 +8300,7 @@
         <w:t>U = 4.208.064 u</w:t>
       </w:r>
       <w:r>
-        <w:t>, p&lt;1e-</w:t>
-      </w:r>
-      <w:proofErr w:type="gramStart"/>
-      <w:r>
-        <w:t>16 ,</w:t>
-      </w:r>
-      <w:proofErr w:type="gramEnd"/>
-      <w:r>
-        <w:t xml:space="preserve"> </w:t>
+        <w:t xml:space="preserve">, p&lt;1e-16 , </w:t>
       </w:r>
       <w:r>
         <w:t>Fehler der neuen Methode systematisch kleiner, Unterschied ist statistisch</w:t>
@@ -9091,21 +8969,7 @@
         <w:rPr>
           <w:color w:val="EE0000"/>
         </w:rPr>
-        <w:t xml:space="preserve"> Oder in </w:t>
-      </w:r>
-      <w:proofErr w:type="gramStart"/>
-      <w:r>
-        <w:rPr>
-          <w:color w:val="EE0000"/>
-        </w:rPr>
-        <w:t>Diskussion</w:t>
-      </w:r>
-      <w:proofErr w:type="gramEnd"/>
-      <w:r>
-        <w:rPr>
-          <w:color w:val="EE0000"/>
-        </w:rPr>
-        <w:t xml:space="preserve"> wenn ich mich auf </w:t>
+        <w:t xml:space="preserve"> Oder in Diskussion wenn ich mich auf </w:t>
       </w:r>
       <w:proofErr w:type="spellStart"/>
       <w:r>
@@ -9234,7 +9098,6 @@
         <w:t>2)</w:t>
       </w:r>
       <w:proofErr w:type="spellStart"/>
-      <w:proofErr w:type="gramStart"/>
       <w:r>
         <w:t>Schweiz:</w:t>
       </w:r>
@@ -9242,7 +9105,6 @@
         <w:t>Für</w:t>
       </w:r>
       <w:proofErr w:type="spellEnd"/>
-      <w:proofErr w:type="gramEnd"/>
       <w:r>
         <w:t xml:space="preserve"> die ausgewählten drei tage auch jeweils die </w:t>
       </w:r>
@@ -9471,15 +9333,7 @@
         <w:t>8833</w:t>
       </w:r>
       <w:r>
-        <w:t xml:space="preserve">. Für Tag 2 Threshold 0.75, es bleiben 4 weitere </w:t>
-      </w:r>
-      <w:proofErr w:type="gramStart"/>
-      <w:r>
-        <w:t>Profile</w:t>
-      </w:r>
-      <w:proofErr w:type="gramEnd"/>
-      <w:r>
-        <w:t xml:space="preserve"> die diesen erfüllen, das ausgewählte Profil hat die </w:t>
+        <w:t xml:space="preserve">. Für Tag 2 Threshold 0.75, es bleiben 4 weitere Profile die diesen erfüllen, das ausgewählte Profil hat die </w:t>
       </w:r>
       <w:r>
         <w:t>höchste</w:t>
@@ -9789,21 +9643,7 @@
         <w:rPr>
           <w:color w:val="EE0000"/>
         </w:rPr>
-        <w:t xml:space="preserve">oder </w:t>
-      </w:r>
-      <w:proofErr w:type="gramStart"/>
-      <w:r>
-        <w:rPr>
-          <w:color w:val="EE0000"/>
-        </w:rPr>
-        <w:t>hier</w:t>
-      </w:r>
-      <w:proofErr w:type="gramEnd"/>
-      <w:r>
-        <w:rPr>
-          <w:color w:val="EE0000"/>
-        </w:rPr>
-        <w:t xml:space="preserve"> wenn nur 4 verbleibende Profile besser auch Einzelprofile? </w:t>
+        <w:t xml:space="preserve">oder hier wenn nur 4 verbleibende Profile besser auch Einzelprofile? </w:t>
       </w:r>
     </w:p>
     <w:p>
@@ -9866,98 +9706,56 @@
         <w:rPr>
           <w:color w:val="EE0000"/>
         </w:rPr>
-        <w:t xml:space="preserve">Frequenzanalyse (optional): Spektrum </w:t>
-      </w:r>
-      <w:proofErr w:type="spellStart"/>
+        <w:t>Frequenzanalyse (optional): Spektrum vorher/nachher</w:t>
+      </w:r>
       <w:r>
         <w:rPr>
           <w:color w:val="EE0000"/>
         </w:rPr>
-        <w:t>vorher</w:t>
-      </w:r>
-      <w:proofErr w:type="spellEnd"/>
-      <w:r>
+        <w:t xml:space="preserve">? </w:t>
+      </w:r>
+    </w:p>
+    <w:p>
+      <w:pPr>
         <w:rPr>
           <w:color w:val="EE0000"/>
         </w:rPr>
-        <w:t>/nachher</w:t>
+      </w:pPr>
+      <w:r>
+        <w:t xml:space="preserve">2)Für Schweizer Datensatz </w:t>
       </w:r>
       <w:r>
         <w:rPr>
           <w:color w:val="EE0000"/>
         </w:rPr>
-        <w:t xml:space="preserve">? </w:t>
-      </w:r>
-    </w:p>
-    <w:p>
-      <w:pPr>
+        <w:t>äquivalent aufstellen?</w:t>
+      </w:r>
+      <w:r>
         <w:rPr>
           <w:color w:val="EE0000"/>
         </w:rPr>
-      </w:pPr>
-      <w:r>
-        <w:t xml:space="preserve">2)Für Schweizer Datensatz </w:t>
-      </w:r>
+        <w:t xml:space="preserve"> Output existiert schon, nur noch einfügen wenn ich weiß wie </w:t>
+      </w:r>
+      <w:proofErr w:type="spellStart"/>
       <w:r>
         <w:rPr>
           <w:color w:val="EE0000"/>
         </w:rPr>
-        <w:t>äquivalent aufstellen?</w:t>
-      </w:r>
+        <w:t>ichs</w:t>
+      </w:r>
+      <w:proofErr w:type="spellEnd"/>
       <w:r>
         <w:rPr>
           <w:color w:val="EE0000"/>
         </w:rPr>
-        <w:t xml:space="preserve"> Output existiert schon, nur noch </w:t>
-      </w:r>
-      <w:proofErr w:type="gramStart"/>
+        <w:t xml:space="preserve"> haben möchte </w:t>
+      </w:r>
+    </w:p>
+    <w:p>
       <w:r>
         <w:rPr>
           <w:color w:val="EE0000"/>
         </w:rPr>
-        <w:t>einfügen</w:t>
-      </w:r>
-      <w:proofErr w:type="gramEnd"/>
-      <w:r>
-        <w:rPr>
-          <w:color w:val="EE0000"/>
-        </w:rPr>
-        <w:t xml:space="preserve"> wenn ich </w:t>
-      </w:r>
-      <w:proofErr w:type="gramStart"/>
-      <w:r>
-        <w:rPr>
-          <w:color w:val="EE0000"/>
-        </w:rPr>
-        <w:t>weiß</w:t>
-      </w:r>
-      <w:proofErr w:type="gramEnd"/>
-      <w:r>
-        <w:rPr>
-          <w:color w:val="EE0000"/>
-        </w:rPr>
-        <w:t xml:space="preserve"> wie </w:t>
-      </w:r>
-      <w:proofErr w:type="spellStart"/>
-      <w:r>
-        <w:rPr>
-          <w:color w:val="EE0000"/>
-        </w:rPr>
-        <w:t>ichs</w:t>
-      </w:r>
-      <w:proofErr w:type="spellEnd"/>
-      <w:r>
-        <w:rPr>
-          <w:color w:val="EE0000"/>
-        </w:rPr>
-        <w:t xml:space="preserve"> haben möchte </w:t>
-      </w:r>
-    </w:p>
-    <w:p>
-      <w:r>
-        <w:rPr>
-          <w:color w:val="EE0000"/>
-        </w:rPr>
         <w:t xml:space="preserve"> </w:t>
       </w:r>
     </w:p>
@@ -10022,7 +9820,6 @@
         <w:t xml:space="preserve"> </w:t>
       </w:r>
       <w:proofErr w:type="spellStart"/>
-      <w:proofErr w:type="gramStart"/>
       <w:r>
         <w:rPr>
           <w:b/>
@@ -10036,15 +9833,7 @@
           <w:b/>
           <w:bCs/>
         </w:rPr>
-        <w:t>..</w:t>
-      </w:r>
-      <w:proofErr w:type="gramEnd"/>
-      <w:r>
-        <w:rPr>
-          <w:b/>
-          <w:bCs/>
-        </w:rPr>
-        <w:t>hier die Ergebni</w:t>
+        <w:t>..hier die Ergebni</w:t>
       </w:r>
       <w:r>
         <w:rPr>
@@ -10276,13 +10065,8 @@
           <w:lang w:val="en-US"/>
         </w:rPr>
       </w:pPr>
-      <w:proofErr w:type="gramStart"/>
-      <w:r>
-        <w:t>!To</w:t>
-      </w:r>
-      <w:proofErr w:type="gramEnd"/>
-      <w:r>
-        <w:t xml:space="preserve"> do: Zu den Fenstergrößen und </w:t>
+      <w:r>
+        <w:t xml:space="preserve">!To do: Zu den Fenstergrößen und </w:t>
       </w:r>
       <w:proofErr w:type="spellStart"/>
       <w:r>
@@ -10370,23 +10154,7 @@
       </w:r>
       <w:proofErr w:type="spellEnd"/>
       <w:r>
-        <w:t xml:space="preserve"> im Plot (da Nan, aber kein großes Problem, spricht wahrscheinlich dafür das </w:t>
-      </w:r>
-      <w:proofErr w:type="gramStart"/>
-      <w:r>
-        <w:t>das Boden</w:t>
-      </w:r>
-      <w:proofErr w:type="gramEnd"/>
-      <w:r>
-        <w:t xml:space="preserve"> </w:t>
-      </w:r>
-      <w:proofErr w:type="gramStart"/>
-      <w:r>
-        <w:t>wär</w:t>
-      </w:r>
-      <w:proofErr w:type="gramEnd"/>
-      <w:r>
-        <w:t xml:space="preserve"> und dieser mit </w:t>
+        <w:t xml:space="preserve"> im Plot (da Nan, aber kein großes Problem, spricht wahrscheinlich dafür das das Boden wär und dieser mit </w:t>
       </w:r>
       <w:proofErr w:type="spellStart"/>
       <w:r>
@@ -11115,15 +10883,7 @@
         </w:numPr>
       </w:pPr>
       <w:r>
-        <w:t xml:space="preserve">Habe ich einen Verweis in der </w:t>
-      </w:r>
-      <w:proofErr w:type="gramStart"/>
-      <w:r>
-        <w:t>Literatur</w:t>
-      </w:r>
-      <w:proofErr w:type="gramEnd"/>
-      <w:r>
-        <w:t xml:space="preserve"> dass </w:t>
+        <w:t xml:space="preserve">Habe ich einen Verweis in der Literatur dass </w:t>
       </w:r>
       <w:proofErr w:type="spellStart"/>
       <w:r>
@@ -11145,15 +10905,7 @@
       </w:r>
       <w:proofErr w:type="spellEnd"/>
       <w:r>
-        <w:t xml:space="preserve"> allgemein </w:t>
-      </w:r>
-      <w:proofErr w:type="gramStart"/>
-      <w:r>
-        <w:t>verweisen</w:t>
-      </w:r>
-      <w:proofErr w:type="gramEnd"/>
-      <w:r>
-        <w:t xml:space="preserve"> dass es wichtig ist die Signale richtig weiterzuverarbeiten </w:t>
+        <w:t xml:space="preserve"> allgemein verweisen dass es wichtig ist die Signale richtig weiterzuverarbeiten </w:t>
       </w:r>
     </w:p>
     <w:p>
@@ -11252,12 +11004,10 @@
         <w:t xml:space="preserve"> </w:t>
       </w:r>
       <w:proofErr w:type="spellStart"/>
-      <w:proofErr w:type="gramStart"/>
       <w:r>
         <w:t>SImilarity</w:t>
       </w:r>
       <w:proofErr w:type="spellEnd"/>
-      <w:proofErr w:type="gramEnd"/>
       <w:r>
         <w:t xml:space="preserve"> als maß für </w:t>
       </w:r>
@@ -11267,37 +11017,13 @@
       </w:r>
       <w:proofErr w:type="spellEnd"/>
       <w:r>
-        <w:t xml:space="preserve">, kann </w:t>
-      </w:r>
-      <w:proofErr w:type="gramStart"/>
-      <w:r>
-        <w:t>zum Einen</w:t>
-      </w:r>
-      <w:proofErr w:type="gramEnd"/>
-      <w:r>
-        <w:t xml:space="preserve"> zeigen, dass Profilähnlichkeit durch Alignment zunimmt (vorher/nachher) und </w:t>
-      </w:r>
-      <w:proofErr w:type="gramStart"/>
-      <w:r>
-        <w:t>zeigt</w:t>
-      </w:r>
-      <w:proofErr w:type="gramEnd"/>
-      <w:r>
-        <w:t xml:space="preserve"> dass auch zwischen den Datensätze gr</w:t>
+        <w:t>, kann zum Einen zeigen, dass Profilähnlichkeit durch Alignment zunimmt (vorher/nachher) und zeigt dass auch zwischen den Datensätze gr</w:t>
       </w:r>
       <w:r>
         <w:t>o</w:t>
       </w:r>
       <w:r>
-        <w:t xml:space="preserve">ße </w:t>
-      </w:r>
-      <w:proofErr w:type="spellStart"/>
-      <w:r>
-        <w:t>unterschiede</w:t>
-      </w:r>
-      <w:proofErr w:type="spellEnd"/>
-      <w:r>
-        <w:t xml:space="preserve"> sein können </w:t>
+        <w:t xml:space="preserve">ße unterschiede sein können </w:t>
       </w:r>
       <w:r>
         <w:t>(</w:t>
@@ -11324,18 +11050,10 @@
       </w:r>
       <w:proofErr w:type="spellEnd"/>
       <w:r>
-        <w:t xml:space="preserve">. </w:t>
-      </w:r>
-      <w:proofErr w:type="gramStart"/>
-      <w:r>
-        <w:t xml:space="preserve">Dies </w:t>
-      </w:r>
-      <w:r>
-        <w:t>,</w:t>
-      </w:r>
-      <w:proofErr w:type="gramEnd"/>
-      <w:r>
-        <w:t xml:space="preserve"> 2004 mit </w:t>
+        <w:t xml:space="preserve">. Dies </w:t>
+      </w:r>
+      <w:r>
+        <w:t xml:space="preserve">, 2004 mit </w:t>
       </w:r>
       <w:proofErr w:type="spellStart"/>
       <w:r>
@@ -11506,15 +11224,7 @@
       </w:r>
       <w:proofErr w:type="spellEnd"/>
       <w:r>
-        <w:t xml:space="preserve"> Wert </w:t>
-      </w:r>
-      <w:proofErr w:type="gramStart"/>
-      <w:r>
-        <w:t>kann</w:t>
-      </w:r>
-      <w:proofErr w:type="gramEnd"/>
-      <w:r>
-        <w:t xml:space="preserve"> gemittelt werden, Grenze nicht ganz objektiv gesetzt, kann sich bei </w:t>
+        <w:t xml:space="preserve"> Wert kann gemittelt werden, Grenze nicht ganz objektiv gesetzt, kann sich bei </w:t>
       </w:r>
       <w:proofErr w:type="spellStart"/>
       <w:r>
@@ -11522,18 +11232,10 @@
       </w:r>
       <w:proofErr w:type="spellEnd"/>
       <w:r>
-        <w:t xml:space="preserve"> </w:t>
-      </w:r>
-      <w:proofErr w:type="gramStart"/>
-      <w:r>
-        <w:t xml:space="preserve">verschieben </w:t>
-      </w:r>
-      <w:r>
-        <w:t>,</w:t>
-      </w:r>
-      <w:proofErr w:type="gramEnd"/>
-      <w:r>
-        <w:t xml:space="preserve"> Ergebnis abhängig von Threshold Wahl, müsste genauer untersucht werden was das für Auswirkungen hat</w:t>
+        <w:t xml:space="preserve"> verschieben </w:t>
+      </w:r>
+      <w:r>
+        <w:t>, Ergebnis abhängig von Threshold Wahl, müsste genauer untersucht werden was das für Auswirkungen hat</w:t>
       </w:r>
     </w:p>
     <w:p>
@@ -11571,15 +11273,7 @@
       </w:r>
       <w:proofErr w:type="spellEnd"/>
       <w:r>
-        <w:t>-Schwellenwerts: Es gibt keinen objektiven Wert? Abhängig von Datensatz und Schneebedingungen (vgl. Tag 1 homogener viel höhere Werte als Tag 2</w:t>
-      </w:r>
-      <w:proofErr w:type="gramStart"/>
-      <w:r>
-        <w:t>) ,</w:t>
-      </w:r>
-      <w:proofErr w:type="gramEnd"/>
-      <w:r>
-        <w:t xml:space="preserve"> Vorschlag </w:t>
+        <w:t xml:space="preserve">-Schwellenwerts: Es gibt keinen objektiven Wert? Abhängig von Datensatz und Schneebedingungen (vgl. Tag 1 homogener viel höhere Werte als Tag 2) , Vorschlag </w:t>
       </w:r>
       <w:proofErr w:type="spellStart"/>
       <w:r>
@@ -11589,13 +11283,8 @@
       <w:r>
         <w:t xml:space="preserve"> &gt; 0.8 und dann reduzieren falls zu hoch, Darstellung in Matrix Form ist hier gute Visualisierung über gesamten Datensatz, Muster können erkannt werden </w:t>
       </w:r>
-      <w:proofErr w:type="gramStart"/>
-      <w:r>
-        <w:t>Aktuell</w:t>
-      </w:r>
-      <w:proofErr w:type="gramEnd"/>
-      <w:r>
-        <w:t xml:space="preserve"> empirischer wert</w:t>
+      <w:r>
+        <w:t>Aktuell empirischer wert</w:t>
       </w:r>
     </w:p>
     <w:p>
@@ -11620,15 +11309,7 @@
         <w:t>: Nicht d</w:t>
       </w:r>
       <w:r>
-        <w:t xml:space="preserve">irekt erkennbar, </w:t>
-      </w:r>
-      <w:proofErr w:type="gramStart"/>
-      <w:r>
-        <w:t>könnte ???</w:t>
-      </w:r>
-      <w:proofErr w:type="gramEnd"/>
-      <w:r>
-        <w:t xml:space="preserve"> Hier Bezug auf mikromechanisches Modell? Was </w:t>
+        <w:t xml:space="preserve">irekt erkennbar, könnte ??? Hier Bezug auf mikromechanisches Modell? Was </w:t>
       </w:r>
       <w:proofErr w:type="spellStart"/>
       <w:r>
@@ -11796,15 +11477,7 @@
       </w:r>
       <w:proofErr w:type="spellEnd"/>
       <w:r>
-        <w:t xml:space="preserve">, Proksch) und frage ob das für alle schneearten gültig? Außerdem </w:t>
-      </w:r>
-      <w:proofErr w:type="gramStart"/>
-      <w:r>
-        <w:t>ganz andere</w:t>
-      </w:r>
-      <w:proofErr w:type="gramEnd"/>
-      <w:r>
-        <w:t xml:space="preserve"> Auflösung </w:t>
+        <w:t xml:space="preserve">, Proksch) und frage ob das für alle schneearten gültig? Außerdem ganz andere Auflösung </w:t>
       </w:r>
     </w:p>
     <w:p/>
@@ -11988,24 +11661,11 @@
         <w:t xml:space="preserve">Anwendungsperspektive: </w:t>
       </w:r>
       <w:r>
-        <w:t xml:space="preserve">Integration in ML-Pipelines für </w:t>
-      </w:r>
-      <w:proofErr w:type="gramStart"/>
-      <w:r>
-        <w:t xml:space="preserve">Klassifikation </w:t>
-      </w:r>
-      <w:r>
-        <w:t>,</w:t>
-      </w:r>
-      <w:proofErr w:type="gramEnd"/>
-      <w:r>
-        <w:t xml:space="preserve"> auch für </w:t>
-      </w:r>
-      <w:proofErr w:type="gramStart"/>
-      <w:r>
-        <w:t>SSA Berechnung</w:t>
-      </w:r>
-      <w:proofErr w:type="gramEnd"/>
+        <w:t xml:space="preserve">Integration in ML-Pipelines für Klassifikation </w:t>
+      </w:r>
+      <w:r>
+        <w:t>, auch für SSA Berechnung</w:t>
+      </w:r>
     </w:p>
     <w:p>
       <w:pPr>
@@ -12027,18 +11687,10 @@
         <w:t xml:space="preserve"> etc.) aufgrund von</w:t>
       </w:r>
       <w:r>
-        <w:t xml:space="preserve"> kleiner </w:t>
-      </w:r>
-      <w:proofErr w:type="gramStart"/>
-      <w:r>
-        <w:t xml:space="preserve">Datenmenge </w:t>
-      </w:r>
-      <w:r>
-        <w:t xml:space="preserve"> Gibt</w:t>
-      </w:r>
-      <w:proofErr w:type="gramEnd"/>
-      <w:r>
-        <w:t xml:space="preserve"> es </w:t>
+        <w:t xml:space="preserve"> kleiner Datenmenge </w:t>
+      </w:r>
+      <w:r>
+        <w:t xml:space="preserve"> Gibt es </w:t>
       </w:r>
       <w:proofErr w:type="spellStart"/>
       <w:r>
@@ -12046,10 +11698,7 @@
       </w:r>
       <w:proofErr w:type="spellEnd"/>
       <w:r>
-        <w:t xml:space="preserve"> auch e</w:t>
-      </w:r>
-      <w:r>
-        <w:t xml:space="preserve">in weiteres Maß zur Überprüfung? </w:t>
+        <w:t xml:space="preserve"> auch ein weiteres Maß zur Überprüfung? </w:t>
       </w:r>
     </w:p>
     <w:p>
@@ -12090,13 +11739,8 @@
         </w:numPr>
       </w:pPr>
       <w:r>
-        <w:t xml:space="preserve">Automatisches Verfahren einbinden </w:t>
-      </w:r>
-      <w:proofErr w:type="gramStart"/>
-      <w:r>
-        <w:t>in ?</w:t>
-      </w:r>
-      <w:proofErr w:type="gramEnd"/>
+        <w:t>Automatisches Verfahren einbinden in ?</w:t>
+      </w:r>
     </w:p>
     <w:p>
       <w:pPr>

</xml_diff>